<commit_message>
Update app, feeder firmware, and water-quality workflows
</commit_message>
<xml_diff>
--- a/docs/Deliverables/Class Diagrams.docx
+++ b/docs/Deliverables/Class Diagrams.docx
@@ -978,21 +978,20 @@
         <w:rPr>
           <w:sz w:val="22"/>
         </w:rPr>
-        <w:t xml:space="preserve"> listens to </w:t>
+        <w:t xml:space="preserve"> subscribes to timestamped anomaly-history records and derives the latest result from the newest record</w:t>
       </w:r>
       <w:proofErr w:type="spellStart"/>
       <w:r>
         <w:rPr>
           <w:sz w:val="22"/>
         </w:rPr>
-        <w:t>Firestore</w:t>
       </w:r>
       <w:proofErr w:type="spellEnd"/>
       <w:r>
         <w:rPr>
           <w:sz w:val="22"/>
         </w:rPr>
-        <w:t xml:space="preserve"> for the current result and recent history records, then maps each record to a </w:t>
+        <w:t xml:space="preserve">, then maps each record to a </w:t>
       </w:r>
       <w:proofErr w:type="spellStart"/>
       <w:r>

</xml_diff>